<commit_message>
2026-07-31 updates. Resume fixes.
</commit_message>
<xml_diff>
--- a/docs/jls-resume.docx
+++ b/docs/jls-resume.docx
@@ -5,12 +5,23 @@
     <w:p>
       <w:pPr>
         <w:pStyle w:val="Heading1"/>
-      </w:pPr>
-      <w:r>
+        <w:rPr>
+          <w:sz w:val="30"/>
+          <w:szCs w:val="36"/>
+        </w:rPr>
+      </w:pPr>
+      <w:r>
+        <w:rPr>
+          <w:sz w:val="30"/>
+          <w:szCs w:val="36"/>
+        </w:rPr>
         <w:t>Jason Langkamer-Smith</w:t>
       </w:r>
     </w:p>
     <w:p>
+      <w:pPr>
+        <w:jc w:val="center"/>
+      </w:pPr>
       <w:r>
         <w:t>218 North 30th Street · Allentown, PA 18104 · (484) 241-0122 · jasonls1015@outlook.com</w:t>
       </w:r>
@@ -23,6 +34,7 @@
     <w:p>
       <w:pPr>
         <w:pStyle w:val="Heading2"/>
+        <w:jc w:val="center"/>
       </w:pPr>
       <w:r>
         <w:t>Senior Technical Writer · Documentation Architect · Developer Experience</w:t>
@@ -224,7 +236,14 @@
           <w:b/>
           <w:bCs/>
         </w:rPr>
-        <w:t>June 2023 – January 2024</w:t>
+        <w:t xml:space="preserve">June 2023 – </w:t>
+      </w:r>
+      <w:r>
+        <w:rPr>
+          <w:b/>
+          <w:bCs/>
+        </w:rPr>
+        <w:t>July 2026</w:t>
       </w:r>
     </w:p>
     <w:p>
@@ -277,10 +296,6 @@
         <w:spacing w:after="160" w:line="278" w:lineRule="auto"/>
       </w:pPr>
       <w:r>
-        <w:rPr>
-          <w:b/>
-          <w:bCs/>
-        </w:rPr>
         <w:t>Designed and built ROOTS</w:t>
       </w:r>
       <w:r>
@@ -303,10 +318,9 @@
           <w:ilvl w:val="1"/>
           <w:numId w:val="37"/>
         </w:numPr>
-        <w:spacing w:after="160" w:line="278" w:lineRule="auto"/>
-      </w:pPr>
-      <w:r>
-        <w:t>Implemented retrieval pipelines over GitHub-based API documentation and internal FAQs.</w:t>
+      </w:pPr>
+      <w:r>
+        <w:t>Implemented retrieval pipelines over GitHub API documentation and internal FAQs.</w:t>
       </w:r>
     </w:p>
     <w:p>
@@ -315,7 +329,7 @@
           <w:ilvl w:val="1"/>
           <w:numId w:val="37"/>
         </w:numPr>
-        <w:spacing w:after="160" w:line="278" w:lineRule="auto"/>
+        <w:spacing w:after="120"/>
       </w:pPr>
       <w:r>
         <w:t>Delivered an authoritative internal support tool that reduced SME interruptions and accelerated developer onboarding.</w:t>
@@ -386,12 +400,12 @@
         <w:spacing w:after="160" w:line="278" w:lineRule="auto"/>
       </w:pPr>
       <w:r>
+        <w:t>Designed a Jira work management project with Slack release notifications to streamline publication workflows.</w:t>
+      </w:r>
+    </w:p>
+    <w:p>
+      <w:r>
         <w:lastRenderedPageBreak/>
-        <w:t>Designed a Jira work management project with Slack release notifications to streamline publication workflows.</w:t>
-      </w:r>
-    </w:p>
-    <w:p>
-      <w:r>
         <w:pict w14:anchorId="3EA99018">
           <v:rect id="_x0000_i1027" style="width:0;height:1.5pt" o:hralign="center" o:hrstd="t" o:hr="t" fillcolor="#a0a0a0" stroked="f"/>
         </w:pict>
@@ -420,7 +434,7 @@
           <w:ilvl w:val="0"/>
           <w:numId w:val="38"/>
         </w:numPr>
-        <w:spacing w:after="160" w:line="278" w:lineRule="auto"/>
+        <w:spacing w:after="60" w:line="278" w:lineRule="auto"/>
       </w:pPr>
       <w:r>
         <w:t xml:space="preserve">Delivered </w:t>
@@ -442,7 +456,7 @@
           <w:ilvl w:val="0"/>
           <w:numId w:val="38"/>
         </w:numPr>
-        <w:spacing w:after="160" w:line="278" w:lineRule="auto"/>
+        <w:spacing w:after="60" w:line="278" w:lineRule="auto"/>
       </w:pPr>
       <w:r>
         <w:t xml:space="preserve">Authored structured content in an enterprise CCMS using </w:t>
@@ -473,7 +487,7 @@
           <w:ilvl w:val="0"/>
           <w:numId w:val="38"/>
         </w:numPr>
-        <w:spacing w:after="160" w:line="278" w:lineRule="auto"/>
+        <w:spacing w:after="60" w:line="278" w:lineRule="auto"/>
       </w:pPr>
       <w:r>
         <w:t xml:space="preserve">Established a </w:t>
@@ -495,7 +509,7 @@
           <w:ilvl w:val="0"/>
           <w:numId w:val="38"/>
         </w:numPr>
-        <w:spacing w:after="160" w:line="278" w:lineRule="auto"/>
+        <w:spacing w:after="60" w:line="278" w:lineRule="auto"/>
       </w:pPr>
       <w:r>
         <w:t>Designed diagrams and illustrations for architecture documents, including logical flows, sequences, waveforms, and circuit block diagrams.</w:t>
@@ -507,7 +521,7 @@
           <w:ilvl w:val="0"/>
           <w:numId w:val="38"/>
         </w:numPr>
-        <w:spacing w:after="160" w:line="278" w:lineRule="auto"/>
+        <w:spacing w:after="60" w:line="278" w:lineRule="auto"/>
       </w:pPr>
       <w:r>
         <w:t>Managed shared reviews with Adobe Acrobat and Word, implementing thousands of contributor comments.</w:t>
@@ -519,7 +533,7 @@
           <w:ilvl w:val="0"/>
           <w:numId w:val="38"/>
         </w:numPr>
-        <w:spacing w:after="160" w:line="278" w:lineRule="auto"/>
+        <w:spacing w:after="60" w:line="278" w:lineRule="auto"/>
       </w:pPr>
       <w:r>
         <w:t>Delivered training on grammar, style, templates, SharePoint, Microsoft 365 co-authoring, automation, and reporting.</w:t>
@@ -531,7 +545,7 @@
           <w:ilvl w:val="0"/>
           <w:numId w:val="38"/>
         </w:numPr>
-        <w:spacing w:after="160" w:line="278" w:lineRule="auto"/>
+        <w:spacing w:after="60" w:line="278" w:lineRule="auto"/>
       </w:pPr>
       <w:r>
         <w:t>Released documents through a Salesforce + Adobe AEM CMS supporting customer entitlements and lifecycle processing.</w:t>
@@ -567,7 +581,7 @@
           <w:ilvl w:val="0"/>
           <w:numId w:val="39"/>
         </w:numPr>
-        <w:spacing w:after="160" w:line="278" w:lineRule="auto"/>
+        <w:spacing w:after="60" w:line="278" w:lineRule="auto"/>
       </w:pPr>
       <w:r>
         <w:t>Documented integrated circuits for the storage industry by interviewing SMEs and analyzing design documents.</w:t>
@@ -579,7 +593,7 @@
           <w:ilvl w:val="0"/>
           <w:numId w:val="39"/>
         </w:numPr>
-        <w:spacing w:after="160" w:line="278" w:lineRule="auto"/>
+        <w:spacing w:after="60" w:line="278" w:lineRule="auto"/>
       </w:pPr>
       <w:r>
         <w:t xml:space="preserve">Developed custom </w:t>
@@ -634,7 +648,7 @@
           <w:ilvl w:val="0"/>
           <w:numId w:val="40"/>
         </w:numPr>
-        <w:spacing w:after="160" w:line="278" w:lineRule="auto"/>
+        <w:spacing w:after="60" w:line="278" w:lineRule="auto"/>
       </w:pPr>
       <w:r>
         <w:t>Authored 40+ manuals, requirements specifications, technical briefs, installation guides, quick references, and brochures.</w:t>
@@ -646,7 +660,7 @@
           <w:ilvl w:val="0"/>
           <w:numId w:val="40"/>
         </w:numPr>
-        <w:spacing w:after="160" w:line="278" w:lineRule="auto"/>
+        <w:spacing w:after="60" w:line="278" w:lineRule="auto"/>
       </w:pPr>
       <w:r>
         <w:t>Developed online training using Adobe Captivate for point-of-sale cash management software.</w:t>
@@ -760,7 +774,6 @@
         <w:pStyle w:val="Heading2"/>
       </w:pPr>
       <w:r>
-        <w:lastRenderedPageBreak/>
         <w:t>Memberships</w:t>
       </w:r>
     </w:p>
@@ -789,15 +802,16 @@
         <w:t>Creating API Documentation — LinkedIn Learning Certificate</w:t>
       </w:r>
     </w:p>
-    <w:p/>
-    <w:p/>
     <w:sectPr>
-      <w:footerReference w:type="default" r:id="rId8"/>
+      <w:headerReference w:type="default" r:id="rId8"/>
+      <w:footerReference w:type="default" r:id="rId9"/>
+      <w:footerReference w:type="first" r:id="rId10"/>
       <w:type w:val="continuous"/>
       <w:pgSz w:w="12240" w:h="15840"/>
       <w:pgMar w:top="720" w:right="1440" w:bottom="720" w:left="1440" w:header="720" w:footer="432" w:gutter="0"/>
       <w:cols w:space="720"/>
       <w:noEndnote/>
+      <w:titlePg/>
       <w:docGrid w:linePitch="326"/>
     </w:sectPr>
   </w:body>
@@ -861,24 +875,29 @@
       <w:rPr>
         <w:noProof/>
       </w:rPr>
+      <w:t>2</w:t>
+    </w:r>
+  </w:p>
+</w:ftr>
+</file>
+
+<file path=word/footer2.xml><?xml version="1.0" encoding="utf-8"?>
+<w:ftr xmlns:wpc="http://schemas.microsoft.com/office/word/2010/wordprocessingCanvas" xmlns:cx="http://schemas.microsoft.com/office/drawing/2014/chartex" xmlns:cx1="http://schemas.microsoft.com/office/drawing/2015/9/8/chartex" xmlns:cx2="http://schemas.microsoft.com/office/drawing/2015/10/21/chartex" xmlns:cx3="http://schemas.microsoft.com/office/drawing/2016/5/9/chartex" xmlns:cx4="http://schemas.microsoft.com/office/drawing/2016/5/10/chartex" xmlns:cx5="http://schemas.microsoft.com/office/drawing/2016/5/11/chartex" xmlns:cx6="http://schemas.microsoft.com/office/drawing/2016/5/12/chartex" xmlns:cx7="http://schemas.microsoft.com/office/drawing/2016/5/13/chartex" xmlns:cx8="http://schemas.microsoft.com/office/drawing/2016/5/14/chartex" xmlns:mc="http://schemas.openxmlformats.org/markup-compatibility/2006" xmlns:aink="http://schemas.microsoft.com/office/drawing/2016/ink" xmlns:am3d="http://schemas.microsoft.com/office/drawing/2017/model3d" xmlns:o="urn:schemas-microsoft-com:office:office" xmlns:oel="http://schemas.microsoft.com/office/2019/extlst" xmlns:r="http://schemas.openxmlformats.org/officeDocument/2006/relationships" xmlns:m="http://schemas.openxmlformats.org/officeDocument/2006/math" xmlns:v="urn:schemas-microsoft-com:vml" xmlns:wp14="http://schemas.microsoft.com/office/word/2010/wordprocessingDrawing" xmlns:wp="http://schemas.openxmlformats.org/drawingml/2006/wordprocessingDrawing" xmlns:w10="urn:schemas-microsoft-com:office:word" xmlns:w="http://schemas.openxmlformats.org/wordprocessingml/2006/main" xmlns:w14="http://schemas.microsoft.com/office/word/2010/wordml" xmlns:w15="http://schemas.microsoft.com/office/word/2012/wordml" xmlns:w16cei="http://schemas.microsoft.com/office/word/2026/wordml/cei" xmlns:w16cex="http://schemas.microsoft.com/office/word/2018/wordml/cex" xmlns:w16cid="http://schemas.microsoft.com/office/word/2016/wordml/cid" xmlns:w16="http://schemas.microsoft.com/office/word/2018/wordml" xmlns:w16du="http://schemas.microsoft.com/office/word/2023/wordml/word16du" xmlns:w16sdtdh="http://schemas.microsoft.com/office/word/2020/wordml/sdtdatahash" xmlns:w16sdtfl="http://schemas.microsoft.com/office/word/2024/wordml/sdtformatlock" xmlns:w16se="http://schemas.microsoft.com/office/word/2015/wordml/symex" xmlns:wpg="http://schemas.microsoft.com/office/word/2010/wordprocessingGroup" xmlns:wpi="http://schemas.microsoft.com/office/word/2010/wordprocessingInk" xmlns:wne="http://schemas.microsoft.com/office/word/2006/wordml" xmlns:wps="http://schemas.microsoft.com/office/word/2010/wordprocessingShape" mc:Ignorable="w14 w15 w16se w16cid w16 w16cex w16sdtdh w16sdtfl w16du wp14">
+  <w:p>
+    <w:pPr>
+      <w:pStyle w:val="Footer"/>
+      <w:jc w:val="center"/>
+    </w:pPr>
+    <w:r>
       <w:fldChar w:fldCharType="begin"/>
     </w:r>
     <w:r>
-      <w:rPr>
-        <w:noProof/>
-      </w:rPr>
-      <w:instrText xml:space="preserve"> DOCPROPERTY  Pages  \* MERGEFORMAT </w:instrText>
+      <w:instrText xml:space="preserve"> PAGE   \* MERGEFORMAT </w:instrText>
     </w:r>
     <w:r>
-      <w:rPr>
-        <w:noProof/>
-      </w:rPr>
       <w:fldChar w:fldCharType="separate"/>
     </w:r>
     <w:r>
-      <w:rPr>
-        <w:noProof/>
-      </w:rPr>
       <w:t>2</w:t>
     </w:r>
     <w:r>
@@ -886,6 +905,12 @@
         <w:noProof/>
       </w:rPr>
       <w:fldChar w:fldCharType="end"/>
+    </w:r>
+    <w:r>
+      <w:rPr>
+        <w:noProof/>
+      </w:rPr>
+      <w:t xml:space="preserve"> of 2</w:t>
     </w:r>
   </w:p>
 </w:ftr>
@@ -908,6 +933,28 @@
     </w:p>
   </w:footnote>
 </w:footnotes>
+</file>
+
+<file path=word/header1.xml><?xml version="1.0" encoding="utf-8"?>
+<w:hdr xmlns:wpc="http://schemas.microsoft.com/office/word/2010/wordprocessingCanvas" xmlns:cx="http://schemas.microsoft.com/office/drawing/2014/chartex" xmlns:cx1="http://schemas.microsoft.com/office/drawing/2015/9/8/chartex" xmlns:cx2="http://schemas.microsoft.com/office/drawing/2015/10/21/chartex" xmlns:cx3="http://schemas.microsoft.com/office/drawing/2016/5/9/chartex" xmlns:cx4="http://schemas.microsoft.com/office/drawing/2016/5/10/chartex" xmlns:cx5="http://schemas.microsoft.com/office/drawing/2016/5/11/chartex" xmlns:cx6="http://schemas.microsoft.com/office/drawing/2016/5/12/chartex" xmlns:cx7="http://schemas.microsoft.com/office/drawing/2016/5/13/chartex" xmlns:cx8="http://schemas.microsoft.com/office/drawing/2016/5/14/chartex" xmlns:mc="http://schemas.openxmlformats.org/markup-compatibility/2006" xmlns:aink="http://schemas.microsoft.com/office/drawing/2016/ink" xmlns:am3d="http://schemas.microsoft.com/office/drawing/2017/model3d" xmlns:o="urn:schemas-microsoft-com:office:office" xmlns:oel="http://schemas.microsoft.com/office/2019/extlst" xmlns:r="http://schemas.openxmlformats.org/officeDocument/2006/relationships" xmlns:m="http://schemas.openxmlformats.org/officeDocument/2006/math" xmlns:v="urn:schemas-microsoft-com:vml" xmlns:wp14="http://schemas.microsoft.com/office/word/2010/wordprocessingDrawing" xmlns:wp="http://schemas.openxmlformats.org/drawingml/2006/wordprocessingDrawing" xmlns:w10="urn:schemas-microsoft-com:office:word" xmlns:w="http://schemas.openxmlformats.org/wordprocessingml/2006/main" xmlns:w14="http://schemas.microsoft.com/office/word/2010/wordml" xmlns:w15="http://schemas.microsoft.com/office/word/2012/wordml" xmlns:w16cei="http://schemas.microsoft.com/office/word/2026/wordml/cei" xmlns:w16cex="http://schemas.microsoft.com/office/word/2018/wordml/cex" xmlns:w16cid="http://schemas.microsoft.com/office/word/2016/wordml/cid" xmlns:w16="http://schemas.microsoft.com/office/word/2018/wordml" xmlns:w16du="http://schemas.microsoft.com/office/word/2023/wordml/word16du" xmlns:w16sdtdh="http://schemas.microsoft.com/office/word/2020/wordml/sdtdatahash" xmlns:w16sdtfl="http://schemas.microsoft.com/office/word/2024/wordml/sdtformatlock" xmlns:w16se="http://schemas.microsoft.com/office/word/2015/wordml/symex" xmlns:wpg="http://schemas.microsoft.com/office/word/2010/wordprocessingGroup" xmlns:wpi="http://schemas.microsoft.com/office/word/2010/wordprocessingInk" xmlns:wne="http://schemas.microsoft.com/office/word/2006/wordml" xmlns:wps="http://schemas.microsoft.com/office/word/2010/wordprocessingShape" mc:Ignorable="w14 w15 w16se w16cid w16 w16cex w16sdtdh w16sdtfl w16du wp14">
+  <w:p>
+    <w:pPr>
+      <w:pStyle w:val="Header"/>
+      <w:jc w:val="center"/>
+      <w:rPr>
+        <w:sz w:val="36"/>
+        <w:szCs w:val="40"/>
+      </w:rPr>
+    </w:pPr>
+    <w:r>
+      <w:rPr>
+        <w:sz w:val="28"/>
+        <w:szCs w:val="32"/>
+      </w:rPr>
+      <w:t>Jason Langkamer-Smith</w:t>
+    </w:r>
+  </w:p>
+</w:hdr>
 </file>
 
 <file path=word/numbering.xml><?xml version="1.0" encoding="utf-8"?>

</xml_diff>

<commit_message>
2026-08-25. Restructure resume into three role-based instances (TW/CE/KM) with shared snippet library; rebuild deploy workflow for multi-instance web+PDF output; update index.html and README
</commit_message>
<xml_diff>
--- a/docs/jls-resume.docx
+++ b/docs/jls-resume.docx
@@ -169,8 +169,22 @@
         <w:t>Collaboration Platforms:</w:t>
       </w:r>
       <w:r>
-        <w:t xml:space="preserve"> Jira, Confluence, SharePoint, Teams, Slack, Jama, Microsoft 365</w:t>
-      </w:r>
+        <w:t xml:space="preserve"> Jira, Confluence, SharePoint, Teams, Slack, Jama, </w:t>
+      </w:r>
+      <w:r>
+        <w:t xml:space="preserve">Salesforce, </w:t>
+      </w:r>
+      <w:r>
+        <w:t>Microsoft 365</w:t>
+      </w:r>
+      <w:r>
+        <w:t xml:space="preserve">, </w:t>
+      </w:r>
+      <w:proofErr w:type="spellStart"/>
+      <w:r>
+        <w:t>ZenDesk</w:t>
+      </w:r>
+      <w:proofErr w:type="spellEnd"/>
     </w:p>
     <w:p>
       <w:pPr>
@@ -198,6 +212,9 @@
       <w:r>
         <w:t>, SnagIt, Captivate, Audacity</w:t>
       </w:r>
+      <w:r>
+        <w:t>, Clipchamp</w:t>
+      </w:r>
     </w:p>
     <w:p>
       <w:r>
@@ -243,7 +260,14 @@
           <w:b/>
           <w:bCs/>
         </w:rPr>
-        <w:t>July 2026</w:t>
+        <w:t>August</w:t>
+      </w:r>
+      <w:r>
+        <w:rPr>
+          <w:b/>
+          <w:bCs/>
+        </w:rPr>
+        <w:t xml:space="preserve"> 2026</w:t>
       </w:r>
     </w:p>
     <w:p>
@@ -726,15 +750,7 @@
         <w:t>New Jersey Institute of Technology</w:t>
       </w:r>
       <w:r>
-        <w:t xml:space="preserve"> — </w:t>
-      </w:r>
-      <w:proofErr w:type="gramStart"/>
-      <w:r>
-        <w:t>Master’s Degree</w:t>
-      </w:r>
-      <w:proofErr w:type="gramEnd"/>
-      <w:r>
-        <w:t xml:space="preserve"> (Summa Cum Laude)</w:t>
+        <w:t xml:space="preserve"> — Master’s Degree (Summa Cum Laude)</w:t>
       </w:r>
       <w:r>
         <w:br/>
@@ -750,13 +766,8 @@
         <w:t>Indiana University of Pennsylvania</w:t>
       </w:r>
       <w:r>
-        <w:t xml:space="preserve"> — </w:t>
-      </w:r>
-      <w:proofErr w:type="gramStart"/>
-      <w:r>
-        <w:t>Bachelor’s Degree</w:t>
-      </w:r>
-      <w:proofErr w:type="gramEnd"/>
+        <w:t xml:space="preserve"> — Bachelor’s Degree</w:t>
+      </w:r>
       <w:r>
         <w:br/>
         <w:t>Journalism Major · Computer Science Minor</w:t>

</xml_diff>